<commit_message>
[Server] PacketID Enum에 Server Packet 추가 및 필요없는 코드 삭제
</commit_message>
<xml_diff>
--- a/문서/5팀_ProjectProgressReport.docx
+++ b/문서/5팀_ProjectProgressReport.docx
@@ -37167,7 +37167,7 @@
                 <w:tab w:val="left" w:pos="3600"/>
               </w:tabs>
               <w:rPr>
-                <w:rFonts w:ascii="HY헤드라인M" w:eastAsia="HY헤드라인M" w:hint="eastAsia"/>
+                <w:rFonts w:ascii="HY헤드라인M" w:eastAsia="HY헤드라인M"/>
                 <w:color w:val="0070C0"/>
               </w:rPr>
             </w:pPr>
@@ -37219,7 +37219,7 @@
                 <w:tab w:val="left" w:pos="2492"/>
               </w:tabs>
               <w:rPr>
-                <w:rFonts w:ascii="HY헤드라인M" w:eastAsia="HY헤드라인M" w:hint="eastAsia"/>
+                <w:rFonts w:ascii="HY헤드라인M" w:eastAsia="HY헤드라인M"/>
                 <w:color w:val="0070C0"/>
               </w:rPr>
             </w:pPr>
@@ -39124,14 +39124,25 @@
           <w:p>
             <w:pPr>
               <w:rPr>
+                <w:rFonts w:eastAsiaTheme="minorHAnsi"/>
+                <w:color w:val="0070C0"/>
+                <w:sz w:val="16"/>
+                <w:szCs w:val="16"/>
+              </w:rPr>
+            </w:pPr>
+            <w:proofErr w:type="spellStart"/>
+            <w:proofErr w:type="gramStart"/>
+            <w:r>
+              <w:rPr>
                 <w:rFonts w:eastAsiaTheme="minorHAnsi" w:hint="eastAsia"/>
                 <w:color w:val="0070C0"/>
                 <w:sz w:val="16"/>
                 <w:szCs w:val="16"/>
-              </w:rPr>
-            </w:pPr>
-            <w:proofErr w:type="spellStart"/>
-            <w:proofErr w:type="gramStart"/>
+                <w:highlight w:val="yellow"/>
+              </w:rPr>
+              <w:t>AddObject</w:t>
+            </w:r>
+            <w:proofErr w:type="spellEnd"/>
             <w:r>
               <w:rPr>
                 <w:rFonts w:eastAsiaTheme="minorHAnsi" w:hint="eastAsia"/>
@@ -39140,9 +39151,9 @@
                 <w:szCs w:val="16"/>
                 <w:highlight w:val="yellow"/>
               </w:rPr>
-              <w:t>AddObject</w:t>
-            </w:r>
-            <w:proofErr w:type="spellEnd"/>
+              <w:t>(</w:t>
+            </w:r>
+            <w:proofErr w:type="gramEnd"/>
             <w:r>
               <w:rPr>
                 <w:rFonts w:eastAsiaTheme="minorHAnsi" w:hint="eastAsia"/>
@@ -39151,40 +39162,29 @@
                 <w:szCs w:val="16"/>
                 <w:highlight w:val="yellow"/>
               </w:rPr>
-              <w:t>(</w:t>
-            </w:r>
-            <w:proofErr w:type="gramEnd"/>
+              <w:t>)</w:t>
+            </w:r>
+          </w:p>
+          <w:p>
+            <w:pPr>
+              <w:rPr>
+                <w:rFonts w:eastAsiaTheme="minorHAnsi"/>
+                <w:sz w:val="16"/>
+                <w:szCs w:val="16"/>
+              </w:rPr>
+            </w:pPr>
+          </w:p>
+          <w:p>
+            <w:pPr>
+              <w:rPr>
+                <w:rFonts w:eastAsiaTheme="minorHAnsi"/>
+                <w:sz w:val="16"/>
+                <w:szCs w:val="16"/>
+              </w:rPr>
+            </w:pPr>
             <w:r>
               <w:rPr>
                 <w:rFonts w:eastAsiaTheme="minorHAnsi" w:hint="eastAsia"/>
-                <w:color w:val="0070C0"/>
-                <w:sz w:val="16"/>
-                <w:szCs w:val="16"/>
-                <w:highlight w:val="yellow"/>
-              </w:rPr>
-              <w:t>)</w:t>
-            </w:r>
-          </w:p>
-          <w:p>
-            <w:pPr>
-              <w:rPr>
-                <w:rFonts w:eastAsiaTheme="minorHAnsi" w:hint="eastAsia"/>
-                <w:sz w:val="16"/>
-                <w:szCs w:val="16"/>
-              </w:rPr>
-            </w:pPr>
-          </w:p>
-          <w:p>
-            <w:pPr>
-              <w:rPr>
-                <w:rFonts w:eastAsiaTheme="minorHAnsi"/>
-                <w:sz w:val="16"/>
-                <w:szCs w:val="16"/>
-              </w:rPr>
-            </w:pPr>
-            <w:r>
-              <w:rPr>
-                <w:rFonts w:eastAsiaTheme="minorHAnsi" w:hint="eastAsia"/>
                 <w:sz w:val="16"/>
                 <w:szCs w:val="16"/>
               </w:rPr>
@@ -39194,7 +39194,7 @@
           <w:p>
             <w:pPr>
               <w:rPr>
-                <w:rFonts w:eastAsiaTheme="minorHAnsi" w:hint="eastAsia"/>
+                <w:rFonts w:eastAsiaTheme="minorHAnsi"/>
                 <w:sz w:val="16"/>
                 <w:szCs w:val="16"/>
               </w:rPr>
@@ -39288,7 +39288,7 @@
           <w:p>
             <w:pPr>
               <w:rPr>
-                <w:rFonts w:eastAsiaTheme="minorHAnsi" w:hint="eastAsia"/>
+                <w:rFonts w:eastAsiaTheme="minorHAnsi"/>
                 <w:color w:val="0070C0"/>
                 <w:sz w:val="16"/>
                 <w:szCs w:val="16"/>

</xml_diff>